<commit_message>
Update P3 report and archive with verified manual episodes
</commit_message>
<xml_diff>
--- a/P3.docx
+++ b/P3.docx
@@ -2058,11 +2058,16 @@
       </w:r>
     </w:p>
     <w:p>
+      <w:r>
+        <w:br w:type="page"/>
+      </w:r>
+    </w:p>
+    <w:p>
       <w:pPr>
         <w:pStyle w:val="Heading1"/>
       </w:pPr>
       <w:r>
-        <w:t>7 Условия запуска и источники</w:t>
+        <w:t>7 Ручное управление</w:t>
       </w:r>
     </w:p>
     <w:p>
@@ -2070,7 +2075,55 @@
         <w:widowControl/>
       </w:pPr>
       <w:r>
-        <w:t>Работа выполнена в Kaggle на Tesla T4: Python 3.12.3, PyTorch 2.7.1+cu128, MuJoCo 3.11.0, LeRobot 0.4.4. Сохранение и возобновление дополнены проверками состояния; архитектура, loss, физика и камера не менялись. Строгая битовая воспроизводимость не подтверждена: при контрольном replay в RGB отличались 1–2 значения из 381 024 на 1 LSB.</w:t>
+        <w:t>8 октября выполнена отдельная проверка клавиатурного управления в нативном окне MuJoCo. Клавиши нажимал ассистент-оператор. Использован CPU, Python 3.12.14, MuJoCo 3.5.0 и Torch 2.6.0+cpu; Docker и VNC не использовались.</w:t>
+      </w:r>
+    </w:p>
+    <w:p>
+      <w:pPr>
+        <w:widowControl/>
+      </w:pPr>
+      <w:r>
+        <w:t>В исходном teleop.py команды, обозначенные как XYZ, передавались напрямую в действия суставов. Поэтому использован отдельный помощник: он переводит клавиатурные приращения XYZ в действия суставов через обратную кинематику и удерживает ориентацию кисти. Физика и критерий успеха среды сохранены. Ложное сохранение успеха по Enter исключено; успешный эпизод сохраняется только по реальному результату среды.</w:t>
+      </w:r>
+    </w:p>
+    <w:p>
+      <w:pPr>
+        <w:widowControl/>
+      </w:pPr>
+      <w:r>
+        <w:t>В исходном интерфейсе начаты две попытки: первая отменена, у второй нет сохранённой траектории и подтверждённого успеха. Первая попытка с помощником завершилась неудачей после 102 шагов: захват закрылся без куба. Вторая достигла цели на шаге 135 при seed 42. Это 6,75 с симуляции и 167,83 с реального времени. Высота куба составила 0,525815 м, расстояние до цели — 0,045533 м. Оба условия успеха выполнены; захват остался закрытым.</w:t>
+      </w:r>
+    </w:p>
+    <w:p>
+      <w:pPr>
+        <w:widowControl/>
+      </w:pPr>
+      <w:r>
+        <w:t>В успешной попытке записаны 38 клавиатурных событий. По ним точно восстановлены все 135 целевых положений. После первой неудачи для выбора перемещений использованы также координаты из сохранённой записи, поэтому управление не было исключительно визуальным. Получен один успешный эпизод; доля успеха и обобщение по нему не оценивались.</w:t>
+      </w:r>
+    </w:p>
+    <w:p>
+      <w:pPr>
+        <w:widowControl/>
+      </w:pPr>
+      <w:r>
+        <w:t>Видео содержит начальный кадр и 135 следующих кадров камеры симулятора: всего 136 кадров при 20 fps. Это воспроизведение записанных наблюдений, а не запись рабочего окна в реальном времени. Сохранены обе попытки с помощником, журналы и проверки. Четыре теста помощника пройдены; точный побитовый повтор всех действий не подтверждён.</w:t>
+      </w:r>
+    </w:p>
+    <w:p>
+      <w:pPr>
+        <w:pStyle w:val="Heading1"/>
+      </w:pPr>
+      <w:r>
+        <w:t>8 Условия запуска и источники</w:t>
+      </w:r>
+    </w:p>
+    <w:p>
+      <w:pPr>
+        <w:widowControl/>
+      </w:pPr>
+      <w:r>
+        <w:t>Обучение BC и сравнение политик выполнены в Kaggle на Tesla T4: Python 3.12.3, PyTorch 2.7.1+cu128, MuJoCo 3.11.0, LeRobot 0.4.4. Сохранение и возобновление дополнены проверками состояния; архитектура, loss, физика и камера не менялись. Строгая битовая воспроизводимость не подтверждена: при контрольном replay в RGB отличались 1–2 значения из 381 024 на 1 LSB.</w:t>
       </w:r>
     </w:p>
     <w:p>
@@ -2087,6 +2140,14 @@
       </w:pPr>
       <w:r>
         <w:t>Источники: README курса; model.py, train_bc.py, inference.py, env.py, rollout_diagnostics.py; P3_COMPLETED_TRAINING.json; collection/resume manifests; event-файлы TensorBoard; summary.json, provenance.json, episodes.jsonl и videos.json трёх оценок.</w:t>
+      </w:r>
+    </w:p>
+    <w:p>
+      <w:pPr>
+        <w:widowControl/>
+      </w:pPr>
+      <w:r>
+        <w:t>Ручное управление: manual_cartesian.py, журналы попыток, independent_audit.json и записи NPZ/JSON в PhysicalAI_P3_manual_GUI_verified_20261008.zip.</w:t>
       </w:r>
     </w:p>
     <w:sectPr>

</xml_diff>